<commit_message>
edits in response ot reviewers
</commit_message>
<xml_diff>
--- a/Data/mansucript/Current Draft.docx
+++ b/Data/mansucript/Current Draft.docx
@@ -4689,6 +4689,21 @@
         </w:rPr>
         <w:t xml:space="preserve">at the census tract level. </w:t>
       </w:r>
+      <w:r>
+        <w:rPr>
+          <w:sz w:val="21"/>
+          <w:szCs w:val="21"/>
+          <w:highlight w:val="yellow"/>
+        </w:rPr>
+        <w:t>The two indicators differ in years, which is valid as this is a descriptive not causal analysis.</w:t>
+      </w:r>
+      <w:r>
+        <w:rPr>
+          <w:sz w:val="21"/>
+          <w:szCs w:val="21"/>
+        </w:rPr>
+        <w:t xml:space="preserve"> </w:t>
+      </w:r>
     </w:p>
     <w:p>
       <w:pPr>
@@ -4945,7 +4960,21 @@
           <w:sz w:val="21"/>
           <w:szCs w:val="21"/>
         </w:rPr>
-        <w:t xml:space="preserve">The percentage of </w:t>
+        <w:t xml:space="preserve">The </w:t>
+      </w:r>
+      <w:r>
+        <w:rPr>
+          <w:sz w:val="21"/>
+          <w:szCs w:val="21"/>
+        </w:rPr>
+        <w:t xml:space="preserve">city average </w:t>
+      </w:r>
+      <w:r>
+        <w:rPr>
+          <w:sz w:val="21"/>
+          <w:szCs w:val="21"/>
+        </w:rPr>
+        <w:t xml:space="preserve">percentage of </w:t>
       </w:r>
       <w:r>
         <w:rPr>
@@ -4959,29 +4988,185 @@
           <w:sz w:val="21"/>
           <w:szCs w:val="21"/>
         </w:rPr>
-        <w:t xml:space="preserve"> that lack health insurance ranged from</w:t>
-      </w:r>
-      <w:r>
-        <w:rPr>
-          <w:sz w:val="21"/>
-          <w:szCs w:val="21"/>
-        </w:rPr>
-        <w:t xml:space="preserve"> 4.9% in district 4 to</w:t>
-      </w:r>
-      <w:r>
-        <w:rPr>
-          <w:sz w:val="21"/>
-          <w:szCs w:val="21"/>
-        </w:rPr>
-        <w:t xml:space="preserve"> 11.7% in district 7</w:t>
-      </w:r>
-      <w:r>
-        <w:rPr>
-          <w:sz w:val="21"/>
-          <w:szCs w:val="21"/>
+        <w:t xml:space="preserve"> that lack health insurance </w:t>
+      </w:r>
+      <w:r>
+        <w:rPr>
+          <w:sz w:val="21"/>
+          <w:szCs w:val="21"/>
+        </w:rPr>
+        <w:t xml:space="preserve">was </w:t>
+      </w:r>
+      <w:r>
+        <w:rPr>
+          <w:sz w:val="21"/>
+          <w:szCs w:val="21"/>
+          <w:highlight w:val="yellow"/>
+        </w:rPr>
+        <w:t>7.2%</w:t>
+      </w:r>
+      <w:r>
+        <w:rPr>
+          <w:sz w:val="21"/>
+          <w:szCs w:val="21"/>
+          <w:highlight w:val="yellow"/>
+        </w:rPr>
+        <w:t xml:space="preserve"> </w:t>
+      </w:r>
+      <w:r>
+        <w:rPr>
+          <w:sz w:val="21"/>
+          <w:szCs w:val="21"/>
+          <w:highlight w:val="yellow"/>
+        </w:rPr>
+        <w:t>(90% margin of error: 0.</w:t>
+      </w:r>
+      <w:r>
+        <w:rPr>
+          <w:sz w:val="21"/>
+          <w:szCs w:val="21"/>
+          <w:highlight w:val="yellow"/>
+        </w:rPr>
+        <w:t>1</w:t>
+      </w:r>
+      <w:r>
+        <w:rPr>
+          <w:sz w:val="21"/>
+          <w:szCs w:val="21"/>
+          <w:highlight w:val="yellow"/>
+        </w:rPr>
+        <w:t xml:space="preserve">%) </w:t>
+      </w:r>
+      <w:r>
+        <w:rPr>
+          <w:sz w:val="21"/>
+          <w:szCs w:val="21"/>
+          <w:highlight w:val="yellow"/>
+        </w:rPr>
+        <w:t xml:space="preserve"> and </w:t>
+      </w:r>
+      <w:r>
+        <w:rPr>
+          <w:sz w:val="21"/>
+          <w:szCs w:val="21"/>
+          <w:highlight w:val="yellow"/>
+        </w:rPr>
+        <w:t>ranged from</w:t>
+      </w:r>
+      <w:r>
+        <w:rPr>
+          <w:sz w:val="21"/>
+          <w:szCs w:val="21"/>
+          <w:highlight w:val="yellow"/>
+        </w:rPr>
+        <w:t xml:space="preserve"> 4.9%</w:t>
+      </w:r>
+      <w:r>
+        <w:rPr>
+          <w:sz w:val="21"/>
+          <w:szCs w:val="21"/>
+          <w:highlight w:val="yellow"/>
         </w:rPr>
         <w:t xml:space="preserve"> (</w:t>
       </w:r>
+      <w:proofErr w:type="spellStart"/>
+      <w:r>
+        <w:rPr>
+          <w:sz w:val="21"/>
+          <w:szCs w:val="21"/>
+          <w:highlight w:val="yellow"/>
+        </w:rPr>
+        <w:t>moe</w:t>
+      </w:r>
+      <w:proofErr w:type="spellEnd"/>
+      <w:r>
+        <w:rPr>
+          <w:sz w:val="21"/>
+          <w:szCs w:val="21"/>
+          <w:highlight w:val="yellow"/>
+        </w:rPr>
+        <w:t>:</w:t>
+      </w:r>
+      <w:r>
+        <w:rPr>
+          <w:sz w:val="21"/>
+          <w:szCs w:val="21"/>
+          <w:highlight w:val="yellow"/>
+        </w:rPr>
+        <w:t xml:space="preserve"> 0.2%)</w:t>
+      </w:r>
+      <w:r>
+        <w:rPr>
+          <w:sz w:val="21"/>
+          <w:szCs w:val="21"/>
+          <w:highlight w:val="yellow"/>
+        </w:rPr>
+        <w:t xml:space="preserve"> in district 4 to</w:t>
+      </w:r>
+      <w:r>
+        <w:rPr>
+          <w:sz w:val="21"/>
+          <w:szCs w:val="21"/>
+          <w:highlight w:val="yellow"/>
+        </w:rPr>
+        <w:t xml:space="preserve"> 11.7%</w:t>
+      </w:r>
+      <w:r>
+        <w:rPr>
+          <w:sz w:val="21"/>
+          <w:szCs w:val="21"/>
+          <w:highlight w:val="yellow"/>
+        </w:rPr>
+        <w:t xml:space="preserve"> (</w:t>
+      </w:r>
+      <w:proofErr w:type="spellStart"/>
+      <w:r>
+        <w:rPr>
+          <w:sz w:val="21"/>
+          <w:szCs w:val="21"/>
+          <w:highlight w:val="yellow"/>
+        </w:rPr>
+        <w:t>moe</w:t>
+      </w:r>
+      <w:proofErr w:type="spellEnd"/>
+      <w:r>
+        <w:rPr>
+          <w:sz w:val="21"/>
+          <w:szCs w:val="21"/>
+          <w:highlight w:val="yellow"/>
+        </w:rPr>
+        <w:t xml:space="preserve">: </w:t>
+      </w:r>
+      <w:r>
+        <w:rPr>
+          <w:sz w:val="21"/>
+          <w:szCs w:val="21"/>
+          <w:highlight w:val="yellow"/>
+        </w:rPr>
+        <w:t>0.2%)</w:t>
+      </w:r>
+      <w:r>
+        <w:rPr>
+          <w:sz w:val="21"/>
+          <w:szCs w:val="21"/>
+          <w:highlight w:val="yellow"/>
+        </w:rPr>
+        <w:t xml:space="preserve"> in</w:t>
+      </w:r>
+      <w:r>
+        <w:rPr>
+          <w:sz w:val="21"/>
+          <w:szCs w:val="21"/>
+        </w:rPr>
+        <w:t xml:space="preserve"> district 7</w:t>
+      </w:r>
+      <w:r>
+        <w:rPr>
+          <w:sz w:val="21"/>
+          <w:szCs w:val="21"/>
+        </w:rPr>
+        <w:t xml:space="preserve"> (</w:t>
+      </w:r>
       <w:r>
         <w:rPr>
           <w:sz w:val="21"/>
@@ -5114,33 +5299,37 @@
           <w:sz w:val="21"/>
           <w:szCs w:val="21"/>
         </w:rPr>
-        <w:t>city average (</w:t>
-      </w:r>
-      <w:r>
-        <w:rPr>
-          <w:sz w:val="21"/>
-          <w:szCs w:val="21"/>
-        </w:rPr>
-        <w:t>7.2</w:t>
-      </w:r>
-      <w:r>
-        <w:rPr>
-          <w:sz w:val="21"/>
-          <w:szCs w:val="21"/>
-        </w:rPr>
-        <w:t xml:space="preserve">%). </w:t>
-      </w:r>
-      <w:r>
-        <w:rPr>
-          <w:sz w:val="21"/>
-          <w:szCs w:val="21"/>
-        </w:rPr>
-        <w:t xml:space="preserve">However, within districts there was </w:t>
-      </w:r>
-      <w:r>
-        <w:rPr>
-          <w:sz w:val="21"/>
-          <w:szCs w:val="21"/>
+        <w:t xml:space="preserve">city average. </w:t>
+      </w:r>
+      <w:r>
+        <w:rPr>
+          <w:sz w:val="21"/>
+          <w:szCs w:val="21"/>
+          <w:highlight w:val="yellow"/>
+        </w:rPr>
+        <w:t xml:space="preserve">However, within districts </w:t>
+      </w:r>
+      <w:r>
+        <w:rPr>
+          <w:sz w:val="21"/>
+          <w:szCs w:val="21"/>
+          <w:highlight w:val="yellow"/>
+        </w:rPr>
+        <w:t xml:space="preserve">variation </w:t>
+      </w:r>
+      <w:r>
+        <w:rPr>
+          <w:sz w:val="21"/>
+          <w:szCs w:val="21"/>
+          <w:highlight w:val="yellow"/>
+        </w:rPr>
+        <w:t xml:space="preserve">was </w:t>
+      </w:r>
+      <w:r>
+        <w:rPr>
+          <w:sz w:val="21"/>
+          <w:szCs w:val="21"/>
+          <w:highlight w:val="yellow"/>
         </w:rPr>
         <w:t>greater</w:t>
       </w:r>
@@ -5148,8 +5337,40 @@
         <w:rPr>
           <w:sz w:val="21"/>
           <w:szCs w:val="21"/>
-        </w:rPr>
-        <w:t xml:space="preserve"> variation. The district with the highest internal variation was district 6, which had a standard deviation of 5.5 and the district with the lowest was district 4, which had a standard deviation of 2.8</w:t>
+          <w:highlight w:val="yellow"/>
+        </w:rPr>
+        <w:t xml:space="preserve"> </w:t>
+      </w:r>
+      <w:r>
+        <w:rPr>
+          <w:sz w:val="21"/>
+          <w:szCs w:val="21"/>
+          <w:highlight w:val="yellow"/>
+        </w:rPr>
+        <w:t xml:space="preserve">than between district </w:t>
+      </w:r>
+      <w:r>
+        <w:rPr>
+          <w:sz w:val="21"/>
+          <w:szCs w:val="21"/>
+          <w:highlight w:val="yellow"/>
+        </w:rPr>
+        <w:t>variation</w:t>
+      </w:r>
+      <w:r>
+        <w:rPr>
+          <w:sz w:val="21"/>
+          <w:szCs w:val="21"/>
+          <w:highlight w:val="yellow"/>
+        </w:rPr>
+        <w:t xml:space="preserve"> for all districts</w:t>
+      </w:r>
+      <w:r>
+        <w:rPr>
+          <w:sz w:val="21"/>
+          <w:szCs w:val="21"/>
+        </w:rPr>
+        <w:t>. The district with the highest internal variation was district 6, which had a standard deviation of 5.5 and the district with the lowest was district 4, which had a standard deviation of 2.8</w:t>
       </w:r>
       <w:r>
         <w:rPr>
@@ -5195,6 +5416,7 @@
           <w:sz w:val="21"/>
           <w:szCs w:val="21"/>
         </w:rPr>
+        <w:lastRenderedPageBreak/>
         <w:t xml:space="preserve">For tree canopy coverage, the </w:t>
       </w:r>
       <w:r>
@@ -5258,15 +5480,7 @@
           <w:sz w:val="21"/>
           <w:szCs w:val="21"/>
         </w:rPr>
-        <w:t xml:space="preserve">The standard </w:t>
-      </w:r>
-      <w:r>
-        <w:rPr>
-          <w:sz w:val="21"/>
-          <w:szCs w:val="21"/>
-        </w:rPr>
-        <w:lastRenderedPageBreak/>
-        <w:t xml:space="preserve">deviation </w:t>
+        <w:t xml:space="preserve">The standard deviation </w:t>
       </w:r>
       <w:r>
         <w:rPr>
@@ -5357,7 +5571,67 @@
           <w:sz w:val="21"/>
           <w:szCs w:val="21"/>
         </w:rPr>
-        <w:t xml:space="preserve"> The maps in Panels C and D of Figure 1 contain a visual representation. </w:t>
+        <w:t xml:space="preserve"> </w:t>
+      </w:r>
+      <w:r>
+        <w:rPr>
+          <w:sz w:val="21"/>
+          <w:szCs w:val="21"/>
+          <w:highlight w:val="yellow"/>
+        </w:rPr>
+        <w:t xml:space="preserve">The </w:t>
+      </w:r>
+      <w:r>
+        <w:rPr>
+          <w:sz w:val="21"/>
+          <w:szCs w:val="21"/>
+          <w:highlight w:val="yellow"/>
+        </w:rPr>
+        <w:t xml:space="preserve">within districts variation was greater than between district variation for all </w:t>
+      </w:r>
+      <w:r>
+        <w:rPr>
+          <w:sz w:val="21"/>
+          <w:szCs w:val="21"/>
+          <w:highlight w:val="yellow"/>
+        </w:rPr>
+        <w:t xml:space="preserve">but two </w:t>
+      </w:r>
+      <w:r>
+        <w:rPr>
+          <w:sz w:val="21"/>
+          <w:szCs w:val="21"/>
+          <w:highlight w:val="yellow"/>
+        </w:rPr>
+        <w:t>districts</w:t>
+      </w:r>
+      <w:r>
+        <w:rPr>
+          <w:sz w:val="21"/>
+          <w:szCs w:val="21"/>
+        </w:rPr>
+        <w:t xml:space="preserve"> (</w:t>
+      </w:r>
+      <w:r>
+        <w:rPr>
+          <w:sz w:val="21"/>
+          <w:szCs w:val="21"/>
+        </w:rPr>
+        <w:t>#1 and #5)</w:t>
+      </w:r>
+      <w:r>
+        <w:rPr>
+          <w:sz w:val="21"/>
+          <w:szCs w:val="21"/>
+        </w:rPr>
+        <w:t xml:space="preserve">. </w:t>
+      </w:r>
+      <w:r>
+        <w:rPr>
+          <w:sz w:val="21"/>
+          <w:szCs w:val="21"/>
+        </w:rPr>
+        <w:t xml:space="preserve">The maps in Panels C and D of Figure 1 contain a visual representation. </w:t>
       </w:r>
     </w:p>
     <w:p>
@@ -6280,6 +6554,13 @@
           <w:sz w:val="21"/>
           <w:szCs w:val="21"/>
         </w:rPr>
+        <w:t xml:space="preserve"> </w:t>
+      </w:r>
+      <w:r>
+        <w:rPr>
+          <w:sz w:val="21"/>
+          <w:szCs w:val="21"/>
+        </w:rPr>
         <w:fldChar w:fldCharType="begin"/>
       </w:r>
       <w:r>
@@ -6702,7 +6983,16 @@
           <w:szCs w:val="21"/>
           <w:highlight w:val="yellow"/>
         </w:rPr>
-        <w:t>when politicians draw district boundaries for their own (or their political parties) benefit</w:t>
+        <w:t xml:space="preserve">when politicians draw district boundaries for </w:t>
+      </w:r>
+      <w:r>
+        <w:rPr>
+          <w:sz w:val="21"/>
+          <w:szCs w:val="21"/>
+          <w:highlight w:val="yellow"/>
+        </w:rPr>
+        <w:lastRenderedPageBreak/>
+        <w:t>their own (or their political parties) benefit</w:t>
       </w:r>
       <w:r>
         <w:rPr>
@@ -7060,8 +7350,168 @@
           <w:sz w:val="21"/>
           <w:szCs w:val="21"/>
         </w:rPr>
-        <w:lastRenderedPageBreak/>
-        <w:t>Moreover, district-level averages are often used in policymaking, budgeting, and performance evaluation. Understanding these averages is critical for identifying systemic disparities and guiding equitable resource allocation. Combining granular and aggregate data provides a fuller picture of health inequities and supports more targeted, effective interventions.</w:t>
+        <w:t xml:space="preserve">Moreover, district-level averages are often used in policymaking, budgeting, and performance evaluation. </w:t>
+      </w:r>
+      <w:r>
+        <w:rPr>
+          <w:rFonts w:ascii="Aptos" w:eastAsia="Aptos" w:hAnsi="Aptos" w:cs="Aptos"/>
+          <w:sz w:val="21"/>
+          <w:szCs w:val="21"/>
+          <w:highlight w:val="yellow"/>
+        </w:rPr>
+        <w:t xml:space="preserve">Understanding </w:t>
+      </w:r>
+      <w:r>
+        <w:rPr>
+          <w:rFonts w:ascii="Aptos" w:eastAsia="Aptos" w:hAnsi="Aptos" w:cs="Aptos"/>
+          <w:sz w:val="21"/>
+          <w:szCs w:val="21"/>
+          <w:highlight w:val="yellow"/>
+        </w:rPr>
+        <w:t xml:space="preserve">district averages </w:t>
+      </w:r>
+      <w:r>
+        <w:rPr>
+          <w:rFonts w:ascii="Aptos" w:eastAsia="Aptos" w:hAnsi="Aptos" w:cs="Aptos"/>
+          <w:sz w:val="21"/>
+          <w:szCs w:val="21"/>
+          <w:highlight w:val="yellow"/>
+        </w:rPr>
+        <w:t xml:space="preserve">is </w:t>
+      </w:r>
+      <w:r>
+        <w:rPr>
+          <w:rFonts w:ascii="Aptos" w:eastAsia="Aptos" w:hAnsi="Aptos" w:cs="Aptos"/>
+          <w:sz w:val="21"/>
+          <w:szCs w:val="21"/>
+          <w:highlight w:val="yellow"/>
+        </w:rPr>
+        <w:t xml:space="preserve">critical for </w:t>
+      </w:r>
+      <w:r>
+        <w:rPr>
+          <w:rFonts w:ascii="Aptos" w:eastAsia="Aptos" w:hAnsi="Aptos" w:cs="Aptos"/>
+          <w:sz w:val="21"/>
+          <w:szCs w:val="21"/>
+          <w:highlight w:val="yellow"/>
+        </w:rPr>
+        <w:t>identifying overall district needs</w:t>
+      </w:r>
+      <w:r>
+        <w:rPr>
+          <w:rFonts w:ascii="Aptos" w:eastAsia="Aptos" w:hAnsi="Aptos" w:cs="Aptos"/>
+          <w:sz w:val="21"/>
+          <w:szCs w:val="21"/>
+          <w:highlight w:val="yellow"/>
+        </w:rPr>
+        <w:t xml:space="preserve"> and city-wide disparities </w:t>
+      </w:r>
+      <w:r>
+        <w:rPr>
+          <w:rFonts w:ascii="Aptos" w:eastAsia="Aptos" w:hAnsi="Aptos" w:cs="Aptos"/>
+          <w:sz w:val="21"/>
+          <w:szCs w:val="21"/>
+          <w:highlight w:val="yellow"/>
+        </w:rPr>
+        <w:t xml:space="preserve">while investigating </w:t>
+      </w:r>
+      <w:r>
+        <w:rPr>
+          <w:rFonts w:ascii="Aptos" w:eastAsia="Aptos" w:hAnsi="Aptos" w:cs="Aptos"/>
+          <w:sz w:val="21"/>
+          <w:szCs w:val="21"/>
+          <w:highlight w:val="yellow"/>
+        </w:rPr>
+        <w:t>within</w:t>
+      </w:r>
+      <w:r>
+        <w:rPr>
+          <w:rFonts w:ascii="Aptos" w:eastAsia="Aptos" w:hAnsi="Aptos" w:cs="Aptos"/>
+          <w:sz w:val="21"/>
+          <w:szCs w:val="21"/>
+          <w:highlight w:val="yellow"/>
+        </w:rPr>
+        <w:t>-</w:t>
+      </w:r>
+      <w:r>
+        <w:rPr>
+          <w:rFonts w:ascii="Aptos" w:eastAsia="Aptos" w:hAnsi="Aptos" w:cs="Aptos"/>
+          <w:sz w:val="21"/>
+          <w:szCs w:val="21"/>
+          <w:highlight w:val="yellow"/>
+        </w:rPr>
+        <w:t xml:space="preserve">district variation </w:t>
+      </w:r>
+      <w:r>
+        <w:rPr>
+          <w:rFonts w:ascii="Aptos" w:eastAsia="Aptos" w:hAnsi="Aptos" w:cs="Aptos"/>
+          <w:sz w:val="21"/>
+          <w:szCs w:val="21"/>
+          <w:highlight w:val="yellow"/>
+        </w:rPr>
+        <w:t>enables</w:t>
+      </w:r>
+      <w:r>
+        <w:rPr>
+          <w:rFonts w:ascii="Aptos" w:eastAsia="Aptos" w:hAnsi="Aptos" w:cs="Aptos"/>
+          <w:sz w:val="21"/>
+          <w:szCs w:val="21"/>
+          <w:highlight w:val="yellow"/>
+        </w:rPr>
+        <w:t xml:space="preserve"> target</w:t>
+      </w:r>
+      <w:r>
+        <w:rPr>
+          <w:rFonts w:ascii="Aptos" w:eastAsia="Aptos" w:hAnsi="Aptos" w:cs="Aptos"/>
+          <w:sz w:val="21"/>
+          <w:szCs w:val="21"/>
+          <w:highlight w:val="yellow"/>
+        </w:rPr>
+        <w:t>ing of</w:t>
+      </w:r>
+      <w:r>
+        <w:rPr>
+          <w:rFonts w:ascii="Aptos" w:eastAsia="Aptos" w:hAnsi="Aptos" w:cs="Aptos"/>
+          <w:sz w:val="21"/>
+          <w:szCs w:val="21"/>
+          <w:highlight w:val="yellow"/>
+        </w:rPr>
+        <w:t xml:space="preserve"> interventions </w:t>
+      </w:r>
+      <w:r>
+        <w:rPr>
+          <w:rFonts w:ascii="Aptos" w:eastAsia="Aptos" w:hAnsi="Aptos" w:cs="Aptos"/>
+          <w:sz w:val="21"/>
+          <w:szCs w:val="21"/>
+          <w:highlight w:val="yellow"/>
+        </w:rPr>
+        <w:t>and equitable</w:t>
+      </w:r>
+      <w:r>
+        <w:rPr>
+          <w:rFonts w:ascii="Aptos" w:eastAsia="Aptos" w:hAnsi="Aptos" w:cs="Aptos"/>
+          <w:sz w:val="21"/>
+          <w:szCs w:val="21"/>
+          <w:highlight w:val="yellow"/>
+        </w:rPr>
+        <w:t xml:space="preserve"> resource allocation</w:t>
+      </w:r>
+      <w:r>
+        <w:rPr>
+          <w:rFonts w:ascii="Aptos" w:eastAsia="Aptos" w:hAnsi="Aptos" w:cs="Aptos"/>
+          <w:sz w:val="21"/>
+          <w:szCs w:val="21"/>
+          <w:highlight w:val="yellow"/>
+        </w:rPr>
+        <w:t>.</w:t>
+      </w:r>
+      <w:r>
+        <w:rPr>
+          <w:rFonts w:ascii="Aptos" w:eastAsia="Aptos" w:hAnsi="Aptos" w:cs="Aptos"/>
+          <w:sz w:val="21"/>
+          <w:szCs w:val="21"/>
+        </w:rPr>
+        <w:t xml:space="preserve"> Combining granular and aggregate data provides a fuller picture of health inequities and supports more targeted, effective interventions.</w:t>
       </w:r>
     </w:p>
     <w:p>

</xml_diff>